<commit_message>
docs: add machine-readable companions to the example deliverable
Two companion files alongside the literature-review deliverable example
so references and research gaps are machine-usable:
- example-literature-review-deliverable.bib — BibTeX export of §8
  (6 synthetic entries, each marked SYNTHETIC; bibtexparser-verified).
- example-literature-review-deliverable.gaps.yml — structured export of
  §5 research gaps + §6 open questions (id / statement / evidence /
  closes_via / linked_claim / status; yaml-verified).

§9 of the deliverable (EN + zh-TW) now documents the companion-file
contract; .docx regenerated from the updated .md. CHANGELOG [1.5.5]
entry updated to list the .bib / .gaps.yml.

Co-Authored-By: Claude Opus 4.7 (1M context) <noreply@anthropic.com>
</commit_message>
<xml_diff>
--- a/docs/example-literature-review-deliverable.docx
+++ b/docs/example-literature-review-deliverable.docx
@@ -4798,6 +4798,81 @@
       </w:r>
       <w:r>
         <w:t xml:space="preserve"> linkage). Raw search output is archived alongside a real deliverable.</w:t>
+      </w:r>
+    </w:p>
+    <w:p>
+      <w:pPr>
+        <w:pStyle w:val="ListParagraph"/>
+        <w:numPr>
+          <w:ilvl w:val="0"/>
+          <w:numId w:val="2"/>
+        </w:numPr>
+        <w:spacing w:after="40" w:before="40"/>
+      </w:pPr>
+      <w:r>
+        <w:rPr>
+          <w:b/>
+          <w:bCs/>
+        </w:rPr>
+        <w:t xml:space="preserve">Companion files (machine-readable):</w:t>
+      </w:r>
+      <w:r>
+        <w:t xml:space="preserve"> every deliverable ships with </w:t>
+      </w:r>
+      <w:r>
+        <w:rPr>
+          <w:rFonts w:ascii="Consolas" w:cs="Consolas" w:eastAsia="Consolas" w:hAnsi="Consolas"/>
+          <w:sz w:val="19"/>
+          <w:szCs w:val="19"/>
+        </w:rPr>
+        <w:t xml:space="preserve">&lt;name&gt;.bib</w:t>
+      </w:r>
+      <w:r>
+        <w:t xml:space="preserve"> — a BibTeX export of §8 References — and </w:t>
+      </w:r>
+      <w:r>
+        <w:rPr>
+          <w:rFonts w:ascii="Consolas" w:cs="Consolas" w:eastAsia="Consolas" w:hAnsi="Consolas"/>
+          <w:sz w:val="19"/>
+          <w:szCs w:val="19"/>
+        </w:rPr>
+        <w:t xml:space="preserve">&lt;name&gt;.gaps.yml</w:t>
+      </w:r>
+      <w:r>
+        <w:t xml:space="preserve"> — a structured export of §5 research gaps + §6 open questions (each gap carries </w:t>
+      </w:r>
+      <w:r>
+        <w:rPr>
+          <w:rFonts w:ascii="Consolas" w:cs="Consolas" w:eastAsia="Consolas" w:hAnsi="Consolas"/>
+          <w:sz w:val="19"/>
+          <w:szCs w:val="19"/>
+        </w:rPr>
+        <w:t xml:space="preserve">statement / evidence / closes_via / linked_claim / status</w:t>
+      </w:r>
+      <w:r>
+        <w:t xml:space="preserve">). For this example: </w:t>
+      </w:r>
+      <w:r>
+        <w:rPr>
+          <w:rFonts w:ascii="Consolas" w:cs="Consolas" w:eastAsia="Consolas" w:hAnsi="Consolas"/>
+          <w:sz w:val="19"/>
+          <w:szCs w:val="19"/>
+        </w:rPr>
+        <w:t xml:space="preserve">example-literature-review-deliverable.bib</w:t>
+      </w:r>
+      <w:r>
+        <w:t xml:space="preserve"> and </w:t>
+      </w:r>
+      <w:r>
+        <w:rPr>
+          <w:rFonts w:ascii="Consolas" w:cs="Consolas" w:eastAsia="Consolas" w:hAnsi="Consolas"/>
+          <w:sz w:val="19"/>
+          <w:szCs w:val="19"/>
+        </w:rPr>
+        <w:t xml:space="preserve">example-literature-review-deliverable.gaps.yml</w:t>
+      </w:r>
+      <w:r>
+        <w:t xml:space="preserve">.</w:t>
       </w:r>
     </w:p>
     <w:p>

</xml_diff>

<commit_message>
docs: align example deliverable with the 3-skill pipeline + cosmetic fixes
Consistency fix — the corrected research-hub spec (PR #68) defines the
literature pipeline as 3 skills: search -> literature-triage-matrix ->
research-design-helper. paper-memory-builder is NOT a pipeline step (its
SKILL.md scopes it to a user's own manuscript draft). Aligns the example
deliverable + the examples.md "Putting it together" pointer to the
3-skill framing; paper-memory-builder is now described as the optional
claim-linkage only.

Cosmetic fixes from the bcf64ee code-review (W1/W2/W3):
- CHANGELOG [1.5.5]: rewrapped the over-long line.
- example-literature-review-deliverable.bib: SYNTHETIC note uses an
  em-dash (not "--", which BibTeX renders as an en-dash); trailing comma
  removed from each entry's last field. gen_bib.py fixed accordingly.

.docx regenerated from the updated .md.

Co-Authored-By: Claude Opus 4.7 (1M context) <noreply@anthropic.com>
</commit_message>
<xml_diff>
--- a/docs/example-literature-review-deliverable.docx
+++ b/docs/example-literature-review-deliverable.docx
@@ -109,7 +109,7 @@
         <w:spacing w:after="80" w:before="80"/>
       </w:pPr>
       <w:r>
-        <w:t xml:space="preserve">This is the consolidated end-to-end output of the research-hub pipeline (</w:t>
+        <w:t xml:space="preserve">This is the consolidated end-to-end output of the research-hub literature pipeline (</w:t>
       </w:r>
       <w:r>
         <w:rPr>
@@ -140,17 +140,6 @@
           <w:szCs w:val="19"/>
         </w:rPr>
         <w:t xml:space="preserve">research-design-helper</w:t>
-      </w:r>
-      <w:r>
-        <w:t xml:space="preserve"> → </w:t>
-      </w:r>
-      <w:r>
-        <w:rPr>
-          <w:rFonts w:ascii="Consolas" w:cs="Consolas" w:eastAsia="Consolas" w:hAnsi="Consolas"/>
-          <w:sz w:val="19"/>
-          <w:szCs w:val="19"/>
-        </w:rPr>
-        <w:t xml:space="preserve">paper-memory-builder</w:t>
       </w:r>
       <w:r>
         <w:t xml:space="preserve">) — the single document those skills add up to.</w:t>
@@ -724,21 +713,6 @@
                 <w:szCs w:val="19"/>
               </w:rPr>
               <w:t xml:space="preserve">research-design-helper</w:t>
-            </w:r>
-            <w:r>
-              <w:rPr>
-                <w:sz w:val="19"/>
-                <w:szCs w:val="19"/>
-              </w:rPr>
-              <w:t xml:space="preserve"> → </w:t>
-            </w:r>
-            <w:r>
-              <w:rPr>
-                <w:rFonts w:ascii="Consolas" w:cs="Consolas" w:eastAsia="Consolas" w:hAnsi="Consolas"/>
-                <w:sz w:val="19"/>
-                <w:szCs w:val="19"/>
-              </w:rPr>
-              <w:t xml:space="preserve">paper-memory-builder</w:t>
             </w:r>
           </w:p>
         </w:tc>
@@ -4742,7 +4716,7 @@
         <w:t xml:space="preserve">Produced by:</w:t>
       </w:r>
       <w:r>
-        <w:t xml:space="preserve"> the research-hub skill pipeline — </w:t>
+        <w:t xml:space="preserve"> the research-hub literature pipeline — </w:t>
       </w:r>
       <w:r>
         <w:rPr>
@@ -4775,7 +4749,7 @@
         <w:t xml:space="preserve">research-design-helper</w:t>
       </w:r>
       <w:r>
-        <w:t xml:space="preserve"> (§5–§7) → </w:t>
+        <w:t xml:space="preserve"> (§5–§7). Raw search output is archived alongside a real deliverable. </w:t>
       </w:r>
       <w:r>
         <w:rPr>
@@ -4786,7 +4760,7 @@
         <w:t xml:space="preserve">paper-memory-builder</w:t>
       </w:r>
       <w:r>
-        <w:t xml:space="preserve"> (the </w:t>
+        <w:t xml:space="preserve"> is not a literature-review step — it runs on a user's own manuscript draft; the </w:t>
       </w:r>
       <w:r>
         <w:rPr>
@@ -4797,7 +4771,7 @@
         <w:t xml:space="preserve">.paper/claims.yml</w:t>
       </w:r>
       <w:r>
-        <w:t xml:space="preserve"> linkage). Raw search output is archived alongside a real deliverable.</w:t>
+        <w:t xml:space="preserve"> claim IDs in §5 come from such a draft, not from the corpus.</w:t>
       </w:r>
     </w:p>
     <w:p>

</xml_diff>